<commit_message>
Fix filter description in РПЗ_До.docx to filtering by absorption
</commit_message>
<xml_diff>
--- a/РПЗ_До.docx
+++ b/РПЗ_До.docx
@@ -61,7 +61,7 @@
                           </pic:cNvPicPr>
                         </pic:nvPicPr>
                         <pic:blipFill>
-                          <a:blip r:embed="rId7"/>
+                          <a:blip r:embed="rId8"/>
                           <a:srcRect/>
                           <a:stretch>
                             <a:fillRect/>
@@ -169,8 +169,13 @@
                 <w:sz w:val="24"/>
                 <w:szCs w:val="24"/>
               </w:rPr>
-              <w:t xml:space="preserve">(национальный </w:t>
-            </w:r>
+              <w:t>(национальный исследовательский университет)»</w:t>
+            </w:r>
+          </w:p>
+          <w:p>
+            <w:pPr>
+              <w:jc w:val="center"/>
+            </w:pPr>
             <w:r>
               <w:rPr>
                 <w:b/>
@@ -178,20 +183,6 @@
                 <w:sz w:val="24"/>
                 <w:szCs w:val="24"/>
               </w:rPr>
-              <w:t>исследовательский университет)»</w:t>
-            </w:r>
-          </w:p>
-          <w:p>
-            <w:pPr>
-              <w:jc w:val="center"/>
-            </w:pPr>
-            <w:r>
-              <w:rPr>
-                <w:b/>
-                <w:bCs/>
-                <w:sz w:val="24"/>
-                <w:szCs w:val="24"/>
-              </w:rPr>
               <w:t>(МГТУ им. Н.Э. Баумана)</w:t>
             </w:r>
           </w:p>
@@ -355,7 +346,7 @@
         </w:rPr>
       </w:pPr>
       <w:r>
-        <w:t>Анализ и реконструкция исторических пигментов (Alchemy of Art History)</w:t>
+        <w:t xml:space="preserve">Анализ и реконструкция исторических пигментов </w:t>
       </w:r>
     </w:p>
     <w:p>
@@ -948,10 +939,7 @@
         <w:ind w:firstLine="709"/>
       </w:pPr>
       <w:r>
-        <w:t xml:space="preserve">1. </w:t>
-      </w:r>
-      <w:r>
-        <w:t>Структура базы данных</w:t>
+        <w:t>1. Структура базы данных</w:t>
       </w:r>
     </w:p>
     <w:p>
@@ -961,7 +949,13 @@
         <w:jc w:val="both"/>
       </w:pPr>
       <w:r>
-        <w:t>Структура данных отражена на ER-диаграмме (рисунок 1). База данных PostgreSQL состоит из трех таблиц: users (пользователи), pigments (пигмента-услуги) и likes (лайки — связь многие-ко-многим между пользователями и пигментми). Каскадное удаление не используется: пигмента удаляются логически через смену статуса на deleted.</w:t>
+        <w:t>Структура данных отражена на ER-диаграмме (рисунок 1). База данных PostgreSQL состоит из трех таблиц: users (пользователи), pigments (пигмента-услуги) и likes (лайки — связь многие-ко-многим между пользователями и пигмент</w:t>
+      </w:r>
+      <w:r>
+        <w:t>а</w:t>
+      </w:r>
+      <w:r>
+        <w:t>ми). Каскадное удаление не используется: пигмента удаляются логически через смену статуса на deleted.</w:t>
       </w:r>
     </w:p>
     <w:p>
@@ -990,7 +984,7 @@
                     <pic:cNvPicPr/>
                   </pic:nvPicPr>
                   <pic:blipFill>
-                    <a:blip r:embed="rId8" cstate="print">
+                    <a:blip r:embed="rId9" cstate="print">
                       <a:extLst>
                         <a:ext uri="{28A0092B-C50C-407E-A947-70E740481C1C}">
                           <a14:useLocalDpi xmlns:a14="http://schemas.microsoft.com/office/drawing/2010/main" val="0"/>
@@ -1045,7 +1039,32 @@
         <w:jc w:val="both"/>
       </w:pPr>
       <w:r>
-        <w:t>Структура системы приведена на диаграмме классов (рисунок 2). Четыре страницы фронтенда («Лента», «Создание услуги», «Плитка», «Авторизация») обращаются к двум доменам бэкенда через интерфейсы API pigments и API users. Домены используют модели Particle, Like и User, которые соответствуют таблицам базы данных.</w:t>
+        <w:t xml:space="preserve">Структура системы приведена на диаграмме классов (рисунок 2). Четыре страницы фронтенда («Лента», «Создание услуги», «Плитка», «Авторизация») обращаются к двум доменам бэкенда через интерфейсы API pigments и API users. Домены используют модели </w:t>
+      </w:r>
+      <w:r>
+        <w:rPr>
+          <w:lang w:val="en-US"/>
+        </w:rPr>
+        <w:t>Pigment</w:t>
+      </w:r>
+      <w:r>
+        <w:t xml:space="preserve">, </w:t>
+      </w:r>
+      <w:proofErr w:type="spellStart"/>
+      <w:r>
+        <w:t>Like</w:t>
+      </w:r>
+      <w:proofErr w:type="spellEnd"/>
+      <w:r>
+        <w:t xml:space="preserve"> и </w:t>
+      </w:r>
+      <w:proofErr w:type="spellStart"/>
+      <w:r>
+        <w:t>User</w:t>
+      </w:r>
+      <w:proofErr w:type="spellEnd"/>
+      <w:r>
+        <w:t>, которые соответствуют таблицам базы данных.</w:t>
       </w:r>
     </w:p>
     <w:p>
@@ -1074,7 +1093,7 @@
                     <pic:cNvPicPr/>
                   </pic:nvPicPr>
                   <pic:blipFill>
-                    <a:blip r:embed="rId9">
+                    <a:blip r:embed="rId10">
                       <a:extLst>
                         <a:ext uri="{28A0092B-C50C-407E-A947-70E740481C1C}">
                           <a14:useLocalDpi xmlns:a14="http://schemas.microsoft.com/office/drawing/2010/main" val="0"/>
@@ -1143,8 +1162,8 @@
           <w:noProof/>
         </w:rPr>
         <w:drawing>
-          <wp:inline distT="0" distB="0" distL="0" distR="0" wp14:anchorId="7C472333" wp14:editId="33A7612D">
-            <wp:extent cx="4529345" cy="6431622"/>
+          <wp:inline distT="0" distB="0" distL="0" distR="0" wp14:anchorId="7C472333" wp14:editId="6D4A11C0">
+            <wp:extent cx="4475441" cy="6355080"/>
             <wp:effectExtent l="0" t="0" r="0" b="0"/>
             <wp:docPr id="5" name="Рисунок 5"/>
             <wp:cNvGraphicFramePr>
@@ -1158,7 +1177,7 @@
                     <pic:cNvPicPr/>
                   </pic:nvPicPr>
                   <pic:blipFill>
-                    <a:blip r:embed="rId10">
+                    <a:blip r:embed="rId11">
                       <a:extLst>
                         <a:ext uri="{28A0092B-C50C-407E-A947-70E740481C1C}">
                           <a14:useLocalDpi xmlns:a14="http://schemas.microsoft.com/office/drawing/2010/main" val="0"/>
@@ -1172,7 +1191,7 @@
                   <pic:spPr>
                     <a:xfrm>
                       <a:off x="0" y="0"/>
-                      <a:ext cx="4529345" cy="6431622"/>
+                      <a:ext cx="4477959" cy="6358656"/>
                     </a:xfrm>
                     <a:prstGeom prst="rect">
                       <a:avLst/>
@@ -1495,7 +1514,7 @@
         </w:rPr>
       </w:pPr>
       <w:r>
-        <w:t>Анализ и реконструкция исторических пигментов (Alchemy of Art History)</w:t>
+        <w:t>Анализ и реконструкция исторических пигментов</w:t>
       </w:r>
     </w:p>
     <w:p>
@@ -1841,6 +1860,8 @@
       </w:pPr>
       <w:r>
         <w:t>2.1</w:t>
+      </w:r>
+      <w:r>
         <w:tab/>
         <w:t>Гость — просматривает плитку опубликованных пигментов с фильтрацией по поглощению (absorption) и ленту пигментов с видео, может зарегистрироваться и войти в систему.</w:t>
       </w:r>
@@ -1855,6 +1876,8 @@
       </w:pPr>
       <w:r>
         <w:t>2.2</w:t>
+      </w:r>
+      <w:r>
         <w:tab/>
         <w:t>Создатель (авторизованный пользователь) — дополнительно создает новую пигментову (черновик) с изображением и видео, публикует ее, удаляет свои пигмента и ставит лайки.</w:t>
       </w:r>
@@ -1886,10 +1909,7 @@
       </w:r>
       <w:r>
         <w:tab/>
-        <w:t>Разработка дизайна трех ст</w:t>
-      </w:r>
-      <w:r>
-        <w:t xml:space="preserve">раниц («Лента», «Добавление», «Плитка») в портретном мобильном формате и базовой серверной шаблонизации с хранением изображений и видео. </w:t>
+        <w:t xml:space="preserve">Разработка дизайна трех страниц («Лента», «Добавление», «Плитка») в портретном мобильном формате и базовой серверной шаблонизации с хранением изображений и видео. </w:t>
       </w:r>
       <w:r>
         <w:rPr>
@@ -1941,6 +1961,8 @@
       </w:pPr>
       <w:r>
         <w:t>3.2</w:t>
+      </w:r>
+      <w:r>
         <w:tab/>
         <w:t>Разработка структуры базы данных и ее подключение к бэкенду, логическое удаление пигментов через SQL UPDATE. Технологии: PostgreSQL, Adminer, GORM, Docker Compose.</w:t>
       </w:r>
@@ -1954,7 +1976,10 @@
         <w:ind w:left="1276" w:hanging="567"/>
       </w:pPr>
       <w:r>
+        <w:lastRenderedPageBreak/>
         <w:t>3.3</w:t>
+      </w:r>
+      <w:r>
         <w:tab/>
         <w:t>Создание веб-сервиса REST API со всей бизнес-логикой: пигмента, черновик, публикация, лента, лайки, регистрация. Технологии: Golang, GORM, MinIO, Postman.</w:t>
       </w:r>
@@ -1968,7 +1993,6 @@
         <w:ind w:left="1276" w:hanging="567"/>
       </w:pPr>
       <w:r>
-        <w:lastRenderedPageBreak/>
         <w:t>3.4</w:t>
       </w:r>
       <w:r>
@@ -2023,8 +2047,6 @@
       </w:r>
       <w:r>
         <w:tab/>
-      </w:r>
-      <w:r>
         <w:t xml:space="preserve">Разработка базового SPA для гостя: страницы «Лента» и «Плитка» с фильтрацией и </w:t>
       </w:r>
       <w:proofErr w:type="spellStart"/>
@@ -2085,6 +2107,8 @@
       </w:pPr>
       <w:r>
         <w:t>3.6</w:t>
+      </w:r>
+      <w:r>
         <w:tab/>
         <w:t>Завершение интерфейса создателя: авторизация, создание и публикация пигментов, удаление, лайки. Технологии: Redux Toolkit, redux-thunk, Axios, кодогенерация API из Swagger.</w:t>
       </w:r>
@@ -2179,10 +2203,7 @@
         <w:ind w:left="1276" w:hanging="567"/>
       </w:pPr>
       <w:r>
-        <w:t>3</w:t>
-      </w:r>
-      <w:r>
-        <w:t>.9</w:t>
+        <w:t>3.9</w:t>
       </w:r>
       <w:r>
         <w:tab/>
@@ -2196,7 +2217,16 @@
         <w:t xml:space="preserve">Технологии: </w:t>
       </w:r>
       <w:r>
-        <w:t>Microsoft Word, draw.io.</w:t>
+        <w:t xml:space="preserve">Microsoft Word, </w:t>
+      </w:r>
+      <w:r>
+        <w:rPr>
+          <w:lang w:val="en-US"/>
+        </w:rPr>
+        <w:t>staruml</w:t>
+      </w:r>
+      <w:r>
+        <w:t>.</w:t>
       </w:r>
     </w:p>
     <w:p>
@@ -2212,10 +2242,7 @@
       </w:r>
       <w:r>
         <w:tab/>
-        <w:t>Оформление репозиториев бэкенда и фронтенда с отдельной веткой для каждой лабораторной работы и описанием в README</w:t>
-      </w:r>
-      <w:r>
-        <w:t xml:space="preserve">. </w:t>
+        <w:t xml:space="preserve">Оформление репозиториев бэкенда и фронтенда с отдельной веткой для каждой лабораторной работы и описанием в README. </w:t>
       </w:r>
       <w:r>
         <w:rPr>
@@ -2348,7 +2375,7 @@
       <w:r>
         <w:t>4.1.4</w:t>
         <w:tab/>
-        <w:t>GET Получение списка опубликованных пигментов с фильтрацией по названию и массе</w:t>
+        <w:t>GET Получение списка опубликованных пигментов с фильтрацией по коэффициенту поглощения (absorption)</w:t>
       </w:r>
     </w:p>
     <w:p>
@@ -2361,7 +2388,10 @@
         <w:jc w:val="both"/>
       </w:pPr>
       <w:r>
+        <w:lastRenderedPageBreak/>
         <w:t>4.1.5</w:t>
+      </w:r>
+      <w:r>
         <w:tab/>
         <w:t>GET Получение ленты: первый пигмент, пигмент по ID или следующая пигмент (next=true)</w:t>
       </w:r>
@@ -2394,6 +2424,8 @@
       </w:pPr>
       <w:r>
         <w:t>4.1.7</w:t>
+      </w:r>
+      <w:r>
         <w:tab/>
         <w:t>POST Создание пигмента-черновика с изображением и видео</w:t>
       </w:r>
@@ -2409,6 +2441,8 @@
       </w:pPr>
       <w:r>
         <w:t>4.1.8</w:t>
+      </w:r>
+      <w:r>
         <w:tab/>
         <w:t>PUT Публикация пигмента (смена статуса на «опубликован»)</w:t>
       </w:r>
@@ -2424,6 +2458,8 @@
       </w:pPr>
       <w:r>
         <w:t>4.1.9</w:t>
+      </w:r>
+      <w:r>
         <w:tab/>
         <w:t>DELETE Логическое удаление своего пигмента</w:t>
       </w:r>
@@ -2439,6 +2475,8 @@
       </w:pPr>
       <w:r>
         <w:t>4.1.10</w:t>
+      </w:r>
+      <w:r>
         <w:tab/>
         <w:t>POST Постановка или отмена лайка пигментове</w:t>
       </w:r>
@@ -2488,10 +2526,7 @@
       </w:r>
       <w:r>
         <w:tab/>
-        <w:t>Отображает пункты нав</w:t>
-      </w:r>
-      <w:r>
-        <w:t>игации:</w:t>
+        <w:t>Отображает пункты навигации:</w:t>
       </w:r>
     </w:p>
     <w:p>
@@ -2576,10 +2611,7 @@
       </w:r>
       <w:r>
         <w:tab/>
-        <w:t xml:space="preserve">Выход (доступно создателю) — </w:t>
-      </w:r>
-      <w:r>
-        <w:t>вызов метода 4.1.3, сброс фильтра и переход в режим гостя</w:t>
+        <w:t>Выход (доступно создателю) — вызов метода 4.1.3, сброс фильтра и переход в режим гостя</w:t>
       </w:r>
     </w:p>
     <w:p>
@@ -2689,10 +2721,7 @@
       </w:r>
       <w:r>
         <w:tab/>
-        <w:t xml:space="preserve">Войти — вызов метода 4.1.2, сохранение JWT, переход в интерфейс </w:t>
-      </w:r>
-      <w:r>
-        <w:t>создателя</w:t>
+        <w:t>Войти — вызов метода 4.1.2, сохранение JWT, переход в интерфейс создателя</w:t>
       </w:r>
     </w:p>
     <w:p>
@@ -2718,6 +2747,7 @@
         <w:ind w:firstLine="709"/>
       </w:pPr>
       <w:r>
+        <w:lastRenderedPageBreak/>
         <w:t>4.4 Плитка пигментов</w:t>
       </w:r>
     </w:p>
@@ -2747,6 +2777,8 @@
       </w:pPr>
       <w:r>
         <w:t>4.4.2</w:t>
+      </w:r>
+      <w:r>
         <w:tab/>
         <w:t>Отображает карточки опубликованных пигментов в две колонки (вызов метода 4.1.4):</w:t>
       </w:r>
@@ -2761,6 +2793,8 @@
       </w:pPr>
       <w:r>
         <w:t>4.4.2.1</w:t>
+      </w:r>
+      <w:r>
         <w:tab/>
         <w:t>Изображение пигмента</w:t>
       </w:r>
@@ -2775,6 +2809,8 @@
       </w:pPr>
       <w:r>
         <w:t>4.4.2.2</w:t>
+      </w:r>
+      <w:r>
         <w:tab/>
         <w:t>Название пигмента</w:t>
       </w:r>
@@ -2789,6 +2825,8 @@
       </w:pPr>
       <w:r>
         <w:t>4.4.2.3</w:t>
+      </w:r>
+      <w:r>
         <w:tab/>
         <w:t>Масса пигмента</w:t>
       </w:r>
@@ -2835,6 +2873,8 @@
       </w:pPr>
       <w:r>
         <w:t>4.4.3.1</w:t>
+      </w:r>
+      <w:r>
         <w:tab/>
         <w:t>Фильтрация по поглощению (absorption) (слайдер и кнопка поиска) — вызов метода 4.1.4 с параметром absorption, значение фильтра сохраняется</w:t>
       </w:r>
@@ -2849,6 +2889,8 @@
       </w:pPr>
       <w:r>
         <w:t>4.4.3.2</w:t>
+      </w:r>
+      <w:r>
         <w:tab/>
         <w:t>Клик по карточке — переход на страницу 4.5, начиная с выбранной пигмента</w:t>
       </w:r>
@@ -2863,6 +2905,8 @@
       </w:pPr>
       <w:r>
         <w:t>4.4.3.3</w:t>
+      </w:r>
+      <w:r>
         <w:tab/>
         <w:t>Удалить (доступно создателю для своих пигментов, признак is_mine) — вызов метода 4.1.9</w:t>
       </w:r>
@@ -2907,6 +2951,8 @@
       </w:pPr>
       <w:r>
         <w:t>4.5.2</w:t>
+      </w:r>
+      <w:r>
         <w:tab/>
         <w:t>Отображает одну пигментову в вертикальной развертке (вызов метода 4.1.5):</w:t>
       </w:r>
@@ -2921,6 +2967,8 @@
       </w:pPr>
       <w:r>
         <w:t>4.5.2.1</w:t>
+      </w:r>
+      <w:r>
         <w:tab/>
         <w:t>Видео пигмента (автовоспроизведение)</w:t>
       </w:r>
@@ -2951,6 +2999,8 @@
       </w:pPr>
       <w:r>
         <w:t>4.5.2.3</w:t>
+      </w:r>
+      <w:r>
         <w:tab/>
         <w:t>Масса и коэффициент поглощения (A) пигмента</w:t>
       </w:r>
@@ -3037,10 +3087,7 @@
       </w:r>
       <w:r>
         <w:tab/>
-        <w:t>Лайк (доступн</w:t>
-      </w:r>
-      <w:r>
-        <w:t xml:space="preserve">о создателю) — вызов метода 4.1.10 с </w:t>
+        <w:t xml:space="preserve">Лайк (доступно создателю) — вызов метода 4.1.10 с </w:t>
       </w:r>
       <w:proofErr w:type="spellStart"/>
       <w:r>
@@ -3066,6 +3113,7 @@
         <w:ind w:firstLine="709"/>
       </w:pPr>
       <w:r>
+        <w:lastRenderedPageBreak/>
         <w:t>4.6 Добавление пигмента</w:t>
       </w:r>
     </w:p>
@@ -3098,10 +3146,7 @@
       </w:r>
       <w:r>
         <w:tab/>
-        <w:t>При открытии загружает черновик пользователя (вызов метода 4.1.6). Если черновик есть, поля заполнены и сразу доступна кнопк</w:t>
-      </w:r>
-      <w:r>
-        <w:t>а «Опубликовать»</w:t>
+        <w:t>При открытии загружает черновик пользователя (вызов метода 4.1.6). Если черновик есть, поля заполнены и сразу доступна кнопка «Опубликовать»</w:t>
       </w:r>
     </w:p>
     <w:p>
@@ -3129,7 +3174,6 @@
         <w:ind w:left="2977" w:hanging="1134"/>
       </w:pPr>
       <w:r>
-        <w:lastRenderedPageBreak/>
         <w:t>4.6.3.1</w:t>
       </w:r>
       <w:r>
@@ -3211,6 +3255,8 @@
       </w:pPr>
       <w:r>
         <w:t>4.6.4.2</w:t>
+      </w:r>
+      <w:r>
         <w:tab/>
         <w:t>Поле коэффициент поглощения (A)а</w:t>
       </w:r>
@@ -3244,8 +3290,6 @@
       </w:r>
       <w:r>
         <w:tab/>
-      </w:r>
-      <w:r>
         <w:t>Действия:</w:t>
       </w:r>
     </w:p>
@@ -3341,10 +3385,7 @@
       </w:r>
       <w:r>
         <w:tab/>
-        <w:t>Оперативная памя</w:t>
-      </w:r>
-      <w:r>
-        <w:t>ть: 4 ГБ</w:t>
+        <w:t>Оперативная память: 4 ГБ</w:t>
       </w:r>
     </w:p>
     <w:p>
@@ -3471,6 +3512,7 @@
           <w:b/>
           <w:bCs/>
         </w:rPr>
+        <w:lastRenderedPageBreak/>
         <w:t>6. Требования к программному обеспечению</w:t>
       </w:r>
     </w:p>
@@ -3678,7 +3720,6 @@
         <w:rPr>
           <w:lang w:val="en-US"/>
         </w:rPr>
-        <w:lastRenderedPageBreak/>
         <w:t>6.1.6</w:t>
       </w:r>
       <w:r>
@@ -3848,10 +3889,18 @@
       </w:r>
       <w:r>
         <w:tab/>
-        <w:t xml:space="preserve">Для нативного приложения: </w:t>
+        <w:t xml:space="preserve">Для </w:t>
       </w:r>
       <w:proofErr w:type="spellStart"/>
       <w:r>
+        <w:t>нативного</w:t>
+      </w:r>
+      <w:proofErr w:type="spellEnd"/>
+      <w:r>
+        <w:t xml:space="preserve"> приложения: </w:t>
+      </w:r>
+      <w:proofErr w:type="spellStart"/>
+      <w:r>
         <w:t>Windows</w:t>
       </w:r>
       <w:proofErr w:type="spellEnd"/>
@@ -3886,7 +3935,7 @@
     <w:p>
       <w:pPr>
         <w:sectPr>
-          <w:footerReference w:type="default" r:id="rId11"/>
+          <w:footerReference w:type="default" r:id="rId12"/>
           <w:pgSz w:w="11906" w:h="16838"/>
           <w:pgMar w:top="1134" w:right="850" w:bottom="1134" w:left="1701" w:header="708" w:footer="708" w:gutter="0"/>
           <w:pgNumType w:start="2"/>
@@ -3935,12 +3984,12 @@
         <w:tblLook w:val="0000" w:firstRow="0" w:lastRow="0" w:firstColumn="0" w:lastColumn="0" w:noHBand="0" w:noVBand="0"/>
       </w:tblPr>
       <w:tblGrid>
-        <w:gridCol w:w="800"/>
-        <w:gridCol w:w="1100"/>
-        <w:gridCol w:w="2700"/>
-        <w:gridCol w:w="3070"/>
-        <w:gridCol w:w="3450"/>
-        <w:gridCol w:w="3450"/>
+        <w:gridCol w:w="795"/>
+        <w:gridCol w:w="1096"/>
+        <w:gridCol w:w="3151"/>
+        <w:gridCol w:w="2956"/>
+        <w:gridCol w:w="3286"/>
+        <w:gridCol w:w="3286"/>
       </w:tblGrid>
       <w:tr>
         <w:trPr>
@@ -5410,6 +5459,9 @@
               </w:rPr>
             </w:pPr>
             <w:r>
+              <w:rPr>
+                <w:lang w:val="en-US"/>
+              </w:rPr>
               <w:t>absorption: float</w:t>
             </w:r>
           </w:p>
@@ -5547,6 +5599,9 @@
               </w:rPr>
             </w:pPr>
             <w:r>
+              <w:rPr>
+                <w:lang w:val="en-US"/>
+              </w:rPr>
               <w:t xml:space="preserve">  reflection: float,</w:t>
             </w:r>
           </w:p>
@@ -5557,6 +5612,9 @@
               </w:rPr>
             </w:pPr>
             <w:r>
+              <w:rPr>
+                <w:lang w:val="en-US"/>
+              </w:rPr>
               <w:t xml:space="preserve">  absorption: float,</w:t>
             </w:r>
           </w:p>
@@ -5995,6 +6053,9 @@
               </w:rPr>
             </w:pPr>
             <w:r>
+              <w:rPr>
+                <w:lang w:val="en-US"/>
+              </w:rPr>
               <w:t xml:space="preserve"> pigment: {</w:t>
             </w:r>
           </w:p>
@@ -6037,16 +6098,36 @@
               </w:rPr>
             </w:pPr>
             <w:r>
-              <w:t xml:space="preserve">  short_description: string,</w:t>
-            </w:r>
-          </w:p>
-          <w:p>
-            <w:pPr>
-              <w:rPr>
-                <w:lang w:val="en-US"/>
-              </w:rPr>
-            </w:pPr>
-            <w:r>
+              <w:rPr>
+                <w:lang w:val="en-US"/>
+              </w:rPr>
+              <w:t xml:space="preserve">  </w:t>
+            </w:r>
+            <w:proofErr w:type="spellStart"/>
+            <w:r>
+              <w:rPr>
+                <w:lang w:val="en-US"/>
+              </w:rPr>
+              <w:t>short_description</w:t>
+            </w:r>
+            <w:proofErr w:type="spellEnd"/>
+            <w:r>
+              <w:rPr>
+                <w:lang w:val="en-US"/>
+              </w:rPr>
+              <w:t>: string,</w:t>
+            </w:r>
+          </w:p>
+          <w:p>
+            <w:pPr>
+              <w:rPr>
+                <w:lang w:val="en-US"/>
+              </w:rPr>
+            </w:pPr>
+            <w:r>
+              <w:rPr>
+                <w:lang w:val="en-US"/>
+              </w:rPr>
               <w:t xml:space="preserve">  reflection: float,</w:t>
             </w:r>
           </w:p>
@@ -6057,6 +6138,9 @@
               </w:rPr>
             </w:pPr>
             <w:r>
+              <w:rPr>
+                <w:lang w:val="en-US"/>
+              </w:rPr>
               <w:t xml:space="preserve">  absorption: float,</w:t>
             </w:r>
           </w:p>
@@ -6170,7 +6254,18 @@
           </w:p>
           <w:p>
             <w:r>
-              <w:t xml:space="preserve">  is_value: 0/1</w:t>
+              <w:rPr>
+                <w:lang w:val="en-US"/>
+              </w:rPr>
+              <w:t xml:space="preserve">  </w:t>
+            </w:r>
+            <w:proofErr w:type="spellStart"/>
+            <w:r>
+              <w:t>is_value</w:t>
+            </w:r>
+            <w:proofErr w:type="spellEnd"/>
+            <w:r>
+              <w:t>: 0/1</w:t>
             </w:r>
           </w:p>
           <w:p>
@@ -6433,16 +6528,36 @@
               </w:rPr>
             </w:pPr>
             <w:r>
-              <w:t xml:space="preserve"> short_description: string,</w:t>
-            </w:r>
-          </w:p>
-          <w:p>
-            <w:pPr>
-              <w:rPr>
-                <w:lang w:val="en-US"/>
-              </w:rPr>
-            </w:pPr>
-            <w:r>
+              <w:rPr>
+                <w:lang w:val="en-US"/>
+              </w:rPr>
+              <w:t xml:space="preserve"> </w:t>
+            </w:r>
+            <w:proofErr w:type="spellStart"/>
+            <w:r>
+              <w:rPr>
+                <w:lang w:val="en-US"/>
+              </w:rPr>
+              <w:t>short_description</w:t>
+            </w:r>
+            <w:proofErr w:type="spellEnd"/>
+            <w:r>
+              <w:rPr>
+                <w:lang w:val="en-US"/>
+              </w:rPr>
+              <w:t>: string,</w:t>
+            </w:r>
+          </w:p>
+          <w:p>
+            <w:pPr>
+              <w:rPr>
+                <w:lang w:val="en-US"/>
+              </w:rPr>
+            </w:pPr>
+            <w:r>
+              <w:rPr>
+                <w:lang w:val="en-US"/>
+              </w:rPr>
               <w:t xml:space="preserve"> reflection: float,</w:t>
             </w:r>
           </w:p>
@@ -6453,6 +6568,9 @@
               </w:rPr>
             </w:pPr>
             <w:r>
+              <w:rPr>
+                <w:lang w:val="en-US"/>
+              </w:rPr>
               <w:t xml:space="preserve"> absorption: float,</w:t>
             </w:r>
           </w:p>
@@ -6789,6 +6907,9 @@
               </w:rPr>
             </w:pPr>
             <w:r>
+              <w:rPr>
+                <w:lang w:val="en-US"/>
+              </w:rPr>
               <w:t xml:space="preserve"> reflection: float,</w:t>
             </w:r>
           </w:p>
@@ -6799,6 +6920,9 @@
               </w:rPr>
             </w:pPr>
             <w:r>
+              <w:rPr>
+                <w:lang w:val="en-US"/>
+              </w:rPr>
               <w:t xml:space="preserve"> absorption: float,</w:t>
             </w:r>
           </w:p>
@@ -6809,7 +6933,24 @@
               </w:rPr>
             </w:pPr>
             <w:r>
-              <w:t xml:space="preserve"> short_description: string,</w:t>
+              <w:rPr>
+                <w:lang w:val="en-US"/>
+              </w:rPr>
+              <w:t xml:space="preserve"> </w:t>
+            </w:r>
+            <w:proofErr w:type="spellStart"/>
+            <w:r>
+              <w:rPr>
+                <w:lang w:val="en-US"/>
+              </w:rPr>
+              <w:t>short_description</w:t>
+            </w:r>
+            <w:proofErr w:type="spellEnd"/>
+            <w:r>
+              <w:rPr>
+                <w:lang w:val="en-US"/>
+              </w:rPr>
+              <w:t>: string,</w:t>
             </w:r>
           </w:p>
           <w:p>
@@ -7266,6 +7407,9 @@
               </w:rPr>
             </w:pPr>
             <w:r>
+              <w:rPr>
+                <w:lang w:val="en-US"/>
+              </w:rPr>
               <w:t xml:space="preserve"> reflection: float,</w:t>
             </w:r>
           </w:p>
@@ -7276,6 +7420,9 @@
               </w:rPr>
             </w:pPr>
             <w:r>
+              <w:rPr>
+                <w:lang w:val="en-US"/>
+              </w:rPr>
               <w:t xml:space="preserve"> absorption: float,</w:t>
             </w:r>
           </w:p>
@@ -7286,7 +7433,24 @@
               </w:rPr>
             </w:pPr>
             <w:r>
-              <w:t xml:space="preserve"> short_description: string</w:t>
+              <w:rPr>
+                <w:lang w:val="en-US"/>
+              </w:rPr>
+              <w:t xml:space="preserve"> </w:t>
+            </w:r>
+            <w:proofErr w:type="spellStart"/>
+            <w:r>
+              <w:rPr>
+                <w:lang w:val="en-US"/>
+              </w:rPr>
+              <w:t>short_description</w:t>
+            </w:r>
+            <w:proofErr w:type="spellEnd"/>
+            <w:r>
+              <w:rPr>
+                <w:lang w:val="en-US"/>
+              </w:rPr>
+              <w:t>: string</w:t>
             </w:r>
           </w:p>
           <w:p>
@@ -7371,6 +7535,9 @@
               </w:rPr>
             </w:pPr>
             <w:r>
+              <w:rPr>
+                <w:lang w:val="en-US"/>
+              </w:rPr>
               <w:t xml:space="preserve"> reflection: float,</w:t>
             </w:r>
           </w:p>
@@ -7381,6 +7548,9 @@
               </w:rPr>
             </w:pPr>
             <w:r>
+              <w:rPr>
+                <w:lang w:val="en-US"/>
+              </w:rPr>
               <w:t xml:space="preserve"> absorption: float,</w:t>
             </w:r>
           </w:p>
@@ -7391,7 +7561,24 @@
               </w:rPr>
             </w:pPr>
             <w:r>
-              <w:t xml:space="preserve"> short_description: string,</w:t>
+              <w:rPr>
+                <w:lang w:val="en-US"/>
+              </w:rPr>
+              <w:t xml:space="preserve"> </w:t>
+            </w:r>
+            <w:proofErr w:type="spellStart"/>
+            <w:r>
+              <w:rPr>
+                <w:lang w:val="en-US"/>
+              </w:rPr>
+              <w:t>short_description</w:t>
+            </w:r>
+            <w:proofErr w:type="spellEnd"/>
+            <w:r>
+              <w:rPr>
+                <w:lang w:val="en-US"/>
+              </w:rPr>
+              <w:t>: string,</w:t>
             </w:r>
           </w:p>
           <w:p>
@@ -7923,7 +8110,7 @@
     </w:tbl>
     <w:p/>
     <w:sectPr>
-      <w:footerReference w:type="default" r:id="rId12"/>
+      <w:footerReference w:type="default" r:id="rId13"/>
       <w:pgSz w:w="16838" w:h="11906" w:orient="landscape"/>
       <w:pgMar w:top="1134" w:right="1134" w:bottom="1134" w:left="1134" w:header="708" w:footer="708" w:gutter="0"/>
       <w:cols w:space="720"/>
@@ -8641,6 +8828,7 @@
   <w:style w:type="character" w:default="1" w:styleId="a0">
     <w:name w:val="Default Paragraph Font"/>
     <w:uiPriority w:val="1"/>
+    <w:semiHidden/>
     <w:unhideWhenUsed/>
   </w:style>
   <w:style w:type="table" w:default="1" w:styleId="a1">
@@ -9121,4 +9309,16 @@
     </a:ext>
   </a:extLst>
 </a:theme>
+</file>
+
+<file path=customXml/item1.xml><?xml version="1.0" encoding="utf-8"?>
+<b:Sources xmlns:b="http://schemas.openxmlformats.org/officeDocument/2006/bibliography" xmlns="http://schemas.openxmlformats.org/officeDocument/2006/bibliography" SelectedStyle="/APASixthEditionOfficeOnline.xsl" StyleName="APA" Version="6"/>
+</file>
+
+<file path=customXml/itemProps1.xml><?xml version="1.0" encoding="utf-8"?>
+<ds:datastoreItem xmlns:ds="http://schemas.openxmlformats.org/officeDocument/2006/customXml" ds:itemID="{95CE0B96-C087-A148-A6F3-F2EB8A70864F}">
+  <ds:schemaRefs>
+    <ds:schemaRef ds:uri="http://schemas.openxmlformats.org/officeDocument/2006/bibliography"/>
+  </ds:schemaRefs>
+</ds:datastoreItem>
 </file>
</xml_diff>

<commit_message>
Update Step 2 fields in РПЗ_До.docx to reflection, absorption and short_description
</commit_message>
<xml_diff>
--- a/РПЗ_До.docx
+++ b/РПЗ_До.docx
@@ -338,25 +338,33 @@
     </w:p>
     <w:p>
       <w:pPr>
+        <w:jc w:val="center"/>
+        <w:rPr>
+          <w:sz w:val="24"/>
+          <w:szCs w:val="24"/>
+        </w:rPr>
+      </w:pPr>
+      <w:r>
         <w:rPr>
           <w:b/>
+          <w:bCs/>
           <w:i/>
+          <w:iCs/>
+          <w:color w:val="1F2328"/>
           <w:sz w:val="40"/>
+          <w:szCs w:val="40"/>
           <w:u w:val="single"/>
-        </w:rPr>
-      </w:pPr>
-      <w:r>
-        <w:t xml:space="preserve">Анализ и реконструкция исторических пигментов </w:t>
-      </w:r>
-    </w:p>
-    <w:p>
-      <w:pPr>
-        <w:rPr>
-          <w:b/>
-          <w:i/>
-          <w:sz w:val="40"/>
-        </w:rPr>
-      </w:pPr>
+          <w:shd w:val="clear" w:color="auto" w:fill="FFFFFF"/>
+        </w:rPr>
+        <w:t>Реконструкция первоначального цвета пигмента.</w:t>
+      </w:r>
+      <w:r>
+        <w:rPr>
+          <w:sz w:val="24"/>
+          <w:szCs w:val="24"/>
+        </w:rPr>
+        <w:t xml:space="preserve"> </w:t>
+      </w:r>
       <w:r>
         <w:rPr>
           <w:b/>
@@ -1507,23 +1515,22 @@
       <w:pPr>
         <w:jc w:val="center"/>
         <w:rPr>
-          <w:b/>
           <w:color w:val="000000" w:themeColor="text1"/>
           <w:sz w:val="36"/>
           <w:szCs w:val="36"/>
         </w:rPr>
       </w:pPr>
       <w:r>
-        <w:t>Анализ и реконструкция исторических пигментов</w:t>
-      </w:r>
-    </w:p>
-    <w:p>
-      <w:pPr>
-        <w:rPr>
-          <w:color w:val="000000" w:themeColor="text1"/>
-          <w:u w:val="single"/>
-        </w:rPr>
-      </w:pPr>
+        <w:rPr>
+          <w:b/>
+          <w:bCs/>
+          <w:color w:val="1F2328"/>
+          <w:sz w:val="36"/>
+          <w:szCs w:val="36"/>
+          <w:shd w:val="clear" w:color="auto" w:fill="FFFFFF"/>
+        </w:rPr>
+        <w:t>Реконструкция первоначального цвета пигмента.</w:t>
+      </w:r>
     </w:p>
     <w:p>
       <w:pPr>
@@ -2374,6 +2381,8 @@
       </w:pPr>
       <w:r>
         <w:t>4.1.4</w:t>
+      </w:r>
+      <w:r>
         <w:tab/>
         <w:t>GET Получение списка опубликованных пигментов с фильтрацией по коэффициенту поглощения (absorption)</w:t>
       </w:r>
@@ -2892,7 +2901,7 @@
       </w:r>
       <w:r>
         <w:tab/>
-        <w:t>Клик по карточке — переход на страницу 4.5, начиная с выбранной пигмента</w:t>
+        <w:t>Клик по карточке — переход на страницу 4.5, начиная с выбранного пигмента</w:t>
       </w:r>
     </w:p>
     <w:p>
@@ -2954,7 +2963,7 @@
       </w:r>
       <w:r>
         <w:tab/>
-        <w:t>Отображает одну пигментову в вертикальной развертке (вызов метода 4.1.5):</w:t>
+        <w:t>Отображает один пигмент в вертикальной развертке (вызов метода 4.1.5):</w:t>
       </w:r>
     </w:p>
     <w:p>
@@ -3002,7 +3011,7 @@
       </w:r>
       <w:r>
         <w:tab/>
-        <w:t>Масса и коэффициент поглощения (A) пигмента</w:t>
+        <w:t>Коэффициенты отражения (R) и поглощения (A) пигмента</w:t>
       </w:r>
     </w:p>
     <w:p>
@@ -3242,7 +3251,7 @@
       </w:r>
       <w:r>
         <w:tab/>
-        <w:t>Поле массы</w:t>
+        <w:t>Поле коэффициента отражения (R / reflection)</w:t>
       </w:r>
     </w:p>
     <w:p>
@@ -3258,7 +3267,7 @@
       </w:r>
       <w:r>
         <w:tab/>
-        <w:t>Поле коэффициент поглощения (A)а</w:t>
+        <w:t>Поле коэффициента поглощения (A / absorption)</w:t>
       </w:r>
     </w:p>
     <w:p>
@@ -3274,7 +3283,7 @@
       </w:r>
       <w:r>
         <w:tab/>
-        <w:t>Поле полного описания</w:t>
+        <w:t>Поле краткого описания пигмента</w:t>
       </w:r>
     </w:p>
     <w:p>
@@ -3984,12 +3993,12 @@
         <w:tblLook w:val="0000" w:firstRow="0" w:lastRow="0" w:firstColumn="0" w:lastColumn="0" w:noHBand="0" w:noVBand="0"/>
       </w:tblPr>
       <w:tblGrid>
-        <w:gridCol w:w="795"/>
+        <w:gridCol w:w="794"/>
         <w:gridCol w:w="1096"/>
         <w:gridCol w:w="3151"/>
-        <w:gridCol w:w="2956"/>
-        <w:gridCol w:w="3286"/>
-        <w:gridCol w:w="3286"/>
+        <w:gridCol w:w="2925"/>
+        <w:gridCol w:w="3302"/>
+        <w:gridCol w:w="3302"/>
       </w:tblGrid>
       <w:tr>
         <w:trPr>
@@ -4318,6 +4327,12 @@
             </w:tcMar>
           </w:tcPr>
           <w:p>
+            <w:pPr>
+              <w:rPr>
+                <w:sz w:val="24"/>
+                <w:szCs w:val="24"/>
+              </w:rPr>
+            </w:pPr>
             <w:r>
               <w:rPr>
                 <w:sz w:val="24"/>
@@ -4716,6 +4731,12 @@
             </w:tcMar>
           </w:tcPr>
           <w:p>
+            <w:pPr>
+              <w:rPr>
+                <w:sz w:val="24"/>
+                <w:szCs w:val="24"/>
+              </w:rPr>
+            </w:pPr>
             <w:r>
               <w:rPr>
                 <w:sz w:val="24"/>
@@ -5133,6 +5154,12 @@
             </w:tcMar>
           </w:tcPr>
           <w:p>
+            <w:pPr>
+              <w:rPr>
+                <w:sz w:val="24"/>
+                <w:szCs w:val="24"/>
+              </w:rPr>
+            </w:pPr>
             <w:r>
               <w:rPr>
                 <w:sz w:val="24"/>
@@ -5360,7 +5387,17 @@
             </w:tcMar>
           </w:tcPr>
           <w:p>
-            <w:r>
+            <w:pPr>
+              <w:rPr>
+                <w:sz w:val="24"/>
+                <w:szCs w:val="24"/>
+              </w:rPr>
+            </w:pPr>
+            <w:r>
+              <w:rPr>
+                <w:sz w:val="24"/>
+                <w:szCs w:val="24"/>
+              </w:rPr>
               <w:t>Список опубликованных пигментов с фильтрацией. Доступно всем</w:t>
             </w:r>
           </w:p>
@@ -5859,7 +5896,17 @@
             </w:tcMar>
           </w:tcPr>
           <w:p>
-            <w:r>
+            <w:pPr>
+              <w:rPr>
+                <w:sz w:val="24"/>
+                <w:szCs w:val="24"/>
+              </w:rPr>
+            </w:pPr>
+            <w:r>
+              <w:rPr>
+                <w:sz w:val="24"/>
+                <w:szCs w:val="24"/>
+              </w:rPr>
               <w:t>Лента: первый пигмент, пигмент по ID или следующая после ID. Доступно всем</w:t>
             </w:r>
           </w:p>
@@ -5883,6 +5930,9 @@
           <w:p>
             <w:pPr>
               <w:rPr>
+                <w:rFonts w:ascii="Courier New" w:hAnsi="Courier New" w:cs="Courier New"/>
+                <w:sz w:val="20"/>
+                <w:szCs w:val="20"/>
                 <w:lang w:val="en-US"/>
               </w:rPr>
             </w:pPr>
@@ -5899,6 +5949,9 @@
           <w:p>
             <w:pPr>
               <w:rPr>
+                <w:rFonts w:ascii="Courier New" w:hAnsi="Courier New" w:cs="Courier New"/>
+                <w:sz w:val="20"/>
+                <w:szCs w:val="20"/>
                 <w:lang w:val="en-US"/>
               </w:rPr>
             </w:pPr>
@@ -5954,6 +6007,9 @@
           <w:p>
             <w:pPr>
               <w:rPr>
+                <w:rFonts w:ascii="Courier New" w:hAnsi="Courier New" w:cs="Courier New"/>
+                <w:sz w:val="20"/>
+                <w:szCs w:val="20"/>
                 <w:lang w:val="en-US"/>
               </w:rPr>
             </w:pPr>
@@ -5968,6 +6024,13 @@
             </w:r>
           </w:p>
           <w:p>
+            <w:pPr>
+              <w:rPr>
+                <w:rFonts w:ascii="Courier New" w:hAnsi="Courier New" w:cs="Courier New"/>
+                <w:sz w:val="20"/>
+                <w:szCs w:val="20"/>
+              </w:rPr>
+            </w:pPr>
             <w:r>
               <w:rPr>
                 <w:rFonts w:ascii="Courier New" w:eastAsia="Courier New" w:hAnsi="Courier New" w:cs="Courier New"/>
@@ -6033,6 +6096,9 @@
           <w:p>
             <w:pPr>
               <w:rPr>
+                <w:rFonts w:ascii="Courier New" w:hAnsi="Courier New" w:cs="Courier New"/>
+                <w:sz w:val="20"/>
+                <w:szCs w:val="20"/>
                 <w:lang w:val="en-US"/>
               </w:rPr>
             </w:pPr>
@@ -6049,11 +6115,17 @@
           <w:p>
             <w:pPr>
               <w:rPr>
-                <w:lang w:val="en-US"/>
-              </w:rPr>
-            </w:pPr>
-            <w:r>
-              <w:rPr>
+                <w:rFonts w:ascii="Courier New" w:hAnsi="Courier New" w:cs="Courier New"/>
+                <w:sz w:val="20"/>
+                <w:szCs w:val="20"/>
+                <w:lang w:val="en-US"/>
+              </w:rPr>
+            </w:pPr>
+            <w:r>
+              <w:rPr>
+                <w:rFonts w:ascii="Courier New" w:hAnsi="Courier New" w:cs="Courier New"/>
+                <w:sz w:val="20"/>
+                <w:szCs w:val="20"/>
                 <w:lang w:val="en-US"/>
               </w:rPr>
               <w:t xml:space="preserve"> pigment: {</w:t>
@@ -6062,6 +6134,9 @@
           <w:p>
             <w:pPr>
               <w:rPr>
+                <w:rFonts w:ascii="Courier New" w:hAnsi="Courier New" w:cs="Courier New"/>
+                <w:sz w:val="20"/>
+                <w:szCs w:val="20"/>
                 <w:lang w:val="en-US"/>
               </w:rPr>
             </w:pPr>
@@ -6078,6 +6153,9 @@
           <w:p>
             <w:pPr>
               <w:rPr>
+                <w:rFonts w:ascii="Courier New" w:hAnsi="Courier New" w:cs="Courier New"/>
+                <w:sz w:val="20"/>
+                <w:szCs w:val="20"/>
                 <w:lang w:val="en-US"/>
               </w:rPr>
             </w:pPr>
@@ -6094,11 +6172,17 @@
           <w:p>
             <w:pPr>
               <w:rPr>
-                <w:lang w:val="en-US"/>
-              </w:rPr>
-            </w:pPr>
-            <w:r>
-              <w:rPr>
+                <w:rFonts w:ascii="Courier New" w:hAnsi="Courier New" w:cs="Courier New"/>
+                <w:sz w:val="20"/>
+                <w:szCs w:val="20"/>
+                <w:lang w:val="en-US"/>
+              </w:rPr>
+            </w:pPr>
+            <w:r>
+              <w:rPr>
+                <w:rFonts w:ascii="Courier New" w:hAnsi="Courier New" w:cs="Courier New"/>
+                <w:sz w:val="20"/>
+                <w:szCs w:val="20"/>
                 <w:lang w:val="en-US"/>
               </w:rPr>
               <w:t xml:space="preserve">  </w:t>
@@ -6106,6 +6190,9 @@
             <w:proofErr w:type="spellStart"/>
             <w:r>
               <w:rPr>
+                <w:rFonts w:ascii="Courier New" w:hAnsi="Courier New" w:cs="Courier New"/>
+                <w:sz w:val="20"/>
+                <w:szCs w:val="20"/>
                 <w:lang w:val="en-US"/>
               </w:rPr>
               <w:t>short_description</w:t>
@@ -6113,6 +6200,9 @@
             <w:proofErr w:type="spellEnd"/>
             <w:r>
               <w:rPr>
+                <w:rFonts w:ascii="Courier New" w:hAnsi="Courier New" w:cs="Courier New"/>
+                <w:sz w:val="20"/>
+                <w:szCs w:val="20"/>
                 <w:lang w:val="en-US"/>
               </w:rPr>
               <w:t>: string,</w:t>
@@ -6121,11 +6211,17 @@
           <w:p>
             <w:pPr>
               <w:rPr>
-                <w:lang w:val="en-US"/>
-              </w:rPr>
-            </w:pPr>
-            <w:r>
-              <w:rPr>
+                <w:rFonts w:ascii="Courier New" w:hAnsi="Courier New" w:cs="Courier New"/>
+                <w:sz w:val="20"/>
+                <w:szCs w:val="20"/>
+                <w:lang w:val="en-US"/>
+              </w:rPr>
+            </w:pPr>
+            <w:r>
+              <w:rPr>
+                <w:rFonts w:ascii="Courier New" w:hAnsi="Courier New" w:cs="Courier New"/>
+                <w:sz w:val="20"/>
+                <w:szCs w:val="20"/>
                 <w:lang w:val="en-US"/>
               </w:rPr>
               <w:t xml:space="preserve">  reflection: float,</w:t>
@@ -6134,11 +6230,17 @@
           <w:p>
             <w:pPr>
               <w:rPr>
-                <w:lang w:val="en-US"/>
-              </w:rPr>
-            </w:pPr>
-            <w:r>
-              <w:rPr>
+                <w:rFonts w:ascii="Courier New" w:hAnsi="Courier New" w:cs="Courier New"/>
+                <w:sz w:val="20"/>
+                <w:szCs w:val="20"/>
+                <w:lang w:val="en-US"/>
+              </w:rPr>
+            </w:pPr>
+            <w:r>
+              <w:rPr>
+                <w:rFonts w:ascii="Courier New" w:hAnsi="Courier New" w:cs="Courier New"/>
+                <w:sz w:val="20"/>
+                <w:szCs w:val="20"/>
                 <w:lang w:val="en-US"/>
               </w:rPr>
               <w:t xml:space="preserve">  absorption: float,</w:t>
@@ -6147,6 +6249,9 @@
           <w:p>
             <w:pPr>
               <w:rPr>
+                <w:rFonts w:ascii="Courier New" w:hAnsi="Courier New" w:cs="Courier New"/>
+                <w:sz w:val="20"/>
+                <w:szCs w:val="20"/>
                 <w:lang w:val="en-US"/>
               </w:rPr>
             </w:pPr>
@@ -6183,6 +6288,9 @@
           <w:p>
             <w:pPr>
               <w:rPr>
+                <w:rFonts w:ascii="Courier New" w:hAnsi="Courier New" w:cs="Courier New"/>
+                <w:sz w:val="20"/>
+                <w:szCs w:val="20"/>
                 <w:lang w:val="en-US"/>
               </w:rPr>
             </w:pPr>
@@ -6219,6 +6327,9 @@
           <w:p>
             <w:pPr>
               <w:rPr>
+                <w:rFonts w:ascii="Courier New" w:hAnsi="Courier New" w:cs="Courier New"/>
+                <w:sz w:val="20"/>
+                <w:szCs w:val="20"/>
                 <w:lang w:val="en-US"/>
               </w:rPr>
             </w:pPr>
@@ -6253,22 +6364,49 @@
             </w:r>
           </w:p>
           <w:p>
-            <w:r>
-              <w:rPr>
+            <w:pPr>
+              <w:rPr>
+                <w:rFonts w:ascii="Courier New" w:hAnsi="Courier New" w:cs="Courier New"/>
+                <w:sz w:val="20"/>
+                <w:szCs w:val="20"/>
+              </w:rPr>
+            </w:pPr>
+            <w:r>
+              <w:rPr>
+                <w:rFonts w:ascii="Courier New" w:hAnsi="Courier New" w:cs="Courier New"/>
+                <w:sz w:val="20"/>
+                <w:szCs w:val="20"/>
                 <w:lang w:val="en-US"/>
               </w:rPr>
               <w:t xml:space="preserve">  </w:t>
             </w:r>
             <w:proofErr w:type="spellStart"/>
             <w:r>
+              <w:rPr>
+                <w:rFonts w:ascii="Courier New" w:hAnsi="Courier New" w:cs="Courier New"/>
+                <w:sz w:val="20"/>
+                <w:szCs w:val="20"/>
+              </w:rPr>
               <w:t>is_value</w:t>
             </w:r>
             <w:proofErr w:type="spellEnd"/>
             <w:r>
+              <w:rPr>
+                <w:rFonts w:ascii="Courier New" w:hAnsi="Courier New" w:cs="Courier New"/>
+                <w:sz w:val="20"/>
+                <w:szCs w:val="20"/>
+              </w:rPr>
               <w:t>: 0/1</w:t>
             </w:r>
           </w:p>
           <w:p>
+            <w:pPr>
+              <w:rPr>
+                <w:rFonts w:ascii="Courier New" w:hAnsi="Courier New" w:cs="Courier New"/>
+                <w:sz w:val="20"/>
+                <w:szCs w:val="20"/>
+              </w:rPr>
+            </w:pPr>
             <w:r>
               <w:rPr>
                 <w:rFonts w:ascii="Courier New" w:eastAsia="Courier New" w:hAnsi="Courier New" w:cs="Courier New"/>
@@ -6279,6 +6417,13 @@
             </w:r>
           </w:p>
           <w:p>
+            <w:pPr>
+              <w:rPr>
+                <w:rFonts w:ascii="Courier New" w:hAnsi="Courier New" w:cs="Courier New"/>
+                <w:sz w:val="20"/>
+                <w:szCs w:val="20"/>
+              </w:rPr>
+            </w:pPr>
             <w:r>
               <w:rPr>
                 <w:rFonts w:ascii="Courier New" w:eastAsia="Courier New" w:hAnsi="Courier New" w:cs="Courier New"/>
@@ -6391,6 +6536,12 @@
             </w:tcMar>
           </w:tcPr>
           <w:p>
+            <w:pPr>
+              <w:rPr>
+                <w:sz w:val="24"/>
+                <w:szCs w:val="24"/>
+              </w:rPr>
+            </w:pPr>
             <w:r>
               <w:rPr>
                 <w:sz w:val="24"/>
@@ -6417,6 +6568,13 @@
             </w:tcMar>
           </w:tcPr>
           <w:p>
+            <w:pPr>
+              <w:rPr>
+                <w:rFonts w:ascii="Courier New" w:hAnsi="Courier New" w:cs="Courier New"/>
+                <w:sz w:val="20"/>
+                <w:szCs w:val="20"/>
+              </w:rPr>
+            </w:pPr>
             <w:proofErr w:type="spellStart"/>
             <w:r>
               <w:rPr>
@@ -6437,6 +6595,13 @@
             </w:r>
           </w:p>
           <w:p>
+            <w:pPr>
+              <w:rPr>
+                <w:rFonts w:ascii="Courier New" w:hAnsi="Courier New" w:cs="Courier New"/>
+                <w:sz w:val="20"/>
+                <w:szCs w:val="20"/>
+              </w:rPr>
+            </w:pPr>
             <w:proofErr w:type="spellStart"/>
             <w:r>
               <w:rPr>
@@ -6476,6 +6641,9 @@
           <w:p>
             <w:pPr>
               <w:rPr>
+                <w:rFonts w:ascii="Courier New" w:hAnsi="Courier New" w:cs="Courier New"/>
+                <w:sz w:val="20"/>
+                <w:szCs w:val="20"/>
                 <w:lang w:val="en-US"/>
               </w:rPr>
             </w:pPr>
@@ -6492,6 +6660,9 @@
           <w:p>
             <w:pPr>
               <w:rPr>
+                <w:rFonts w:ascii="Courier New" w:hAnsi="Courier New" w:cs="Courier New"/>
+                <w:sz w:val="20"/>
+                <w:szCs w:val="20"/>
                 <w:lang w:val="en-US"/>
               </w:rPr>
             </w:pPr>
@@ -6508,6 +6679,9 @@
           <w:p>
             <w:pPr>
               <w:rPr>
+                <w:rFonts w:ascii="Courier New" w:hAnsi="Courier New" w:cs="Courier New"/>
+                <w:sz w:val="20"/>
+                <w:szCs w:val="20"/>
                 <w:lang w:val="en-US"/>
               </w:rPr>
             </w:pPr>
@@ -6524,11 +6698,17 @@
           <w:p>
             <w:pPr>
               <w:rPr>
-                <w:lang w:val="en-US"/>
-              </w:rPr>
-            </w:pPr>
-            <w:r>
-              <w:rPr>
+                <w:rFonts w:ascii="Courier New" w:hAnsi="Courier New" w:cs="Courier New"/>
+                <w:sz w:val="20"/>
+                <w:szCs w:val="20"/>
+                <w:lang w:val="en-US"/>
+              </w:rPr>
+            </w:pPr>
+            <w:r>
+              <w:rPr>
+                <w:rFonts w:ascii="Courier New" w:hAnsi="Courier New" w:cs="Courier New"/>
+                <w:sz w:val="20"/>
+                <w:szCs w:val="20"/>
                 <w:lang w:val="en-US"/>
               </w:rPr>
               <w:t xml:space="preserve"> </w:t>
@@ -6536,6 +6716,9 @@
             <w:proofErr w:type="spellStart"/>
             <w:r>
               <w:rPr>
+                <w:rFonts w:ascii="Courier New" w:hAnsi="Courier New" w:cs="Courier New"/>
+                <w:sz w:val="20"/>
+                <w:szCs w:val="20"/>
                 <w:lang w:val="en-US"/>
               </w:rPr>
               <w:t>short_description</w:t>
@@ -6543,6 +6726,9 @@
             <w:proofErr w:type="spellEnd"/>
             <w:r>
               <w:rPr>
+                <w:rFonts w:ascii="Courier New" w:hAnsi="Courier New" w:cs="Courier New"/>
+                <w:sz w:val="20"/>
+                <w:szCs w:val="20"/>
                 <w:lang w:val="en-US"/>
               </w:rPr>
               <w:t>: string,</w:t>
@@ -6551,11 +6737,17 @@
           <w:p>
             <w:pPr>
               <w:rPr>
-                <w:lang w:val="en-US"/>
-              </w:rPr>
-            </w:pPr>
-            <w:r>
-              <w:rPr>
+                <w:rFonts w:ascii="Courier New" w:hAnsi="Courier New" w:cs="Courier New"/>
+                <w:sz w:val="20"/>
+                <w:szCs w:val="20"/>
+                <w:lang w:val="en-US"/>
+              </w:rPr>
+            </w:pPr>
+            <w:r>
+              <w:rPr>
+                <w:rFonts w:ascii="Courier New" w:hAnsi="Courier New" w:cs="Courier New"/>
+                <w:sz w:val="20"/>
+                <w:szCs w:val="20"/>
                 <w:lang w:val="en-US"/>
               </w:rPr>
               <w:t xml:space="preserve"> reflection: float,</w:t>
@@ -6564,11 +6756,17 @@
           <w:p>
             <w:pPr>
               <w:rPr>
-                <w:lang w:val="en-US"/>
-              </w:rPr>
-            </w:pPr>
-            <w:r>
-              <w:rPr>
+                <w:rFonts w:ascii="Courier New" w:hAnsi="Courier New" w:cs="Courier New"/>
+                <w:sz w:val="20"/>
+                <w:szCs w:val="20"/>
+                <w:lang w:val="en-US"/>
+              </w:rPr>
+            </w:pPr>
+            <w:r>
+              <w:rPr>
+                <w:rFonts w:ascii="Courier New" w:hAnsi="Courier New" w:cs="Courier New"/>
+                <w:sz w:val="20"/>
+                <w:szCs w:val="20"/>
                 <w:lang w:val="en-US"/>
               </w:rPr>
               <w:t xml:space="preserve"> absorption: float,</w:t>
@@ -6577,6 +6775,9 @@
           <w:p>
             <w:pPr>
               <w:rPr>
+                <w:rFonts w:ascii="Courier New" w:hAnsi="Courier New" w:cs="Courier New"/>
+                <w:sz w:val="20"/>
+                <w:szCs w:val="20"/>
                 <w:lang w:val="en-US"/>
               </w:rPr>
             </w:pPr>
@@ -6613,6 +6814,9 @@
           <w:p>
             <w:pPr>
               <w:rPr>
+                <w:rFonts w:ascii="Courier New" w:hAnsi="Courier New" w:cs="Courier New"/>
+                <w:sz w:val="20"/>
+                <w:szCs w:val="20"/>
                 <w:lang w:val="en-US"/>
               </w:rPr>
             </w:pPr>
@@ -6649,6 +6853,9 @@
           <w:p>
             <w:pPr>
               <w:rPr>
+                <w:rFonts w:ascii="Courier New" w:hAnsi="Courier New" w:cs="Courier New"/>
+                <w:sz w:val="20"/>
+                <w:szCs w:val="20"/>
                 <w:lang w:val="en-US"/>
               </w:rPr>
             </w:pPr>
@@ -6683,6 +6890,13 @@
             </w:r>
           </w:p>
           <w:p>
+            <w:pPr>
+              <w:rPr>
+                <w:rFonts w:ascii="Courier New" w:hAnsi="Courier New" w:cs="Courier New"/>
+                <w:sz w:val="20"/>
+                <w:szCs w:val="20"/>
+              </w:rPr>
+            </w:pPr>
             <w:r>
               <w:rPr>
                 <w:rFonts w:ascii="Courier New" w:eastAsia="Courier New" w:hAnsi="Courier New" w:cs="Courier New"/>
@@ -6795,6 +7009,12 @@
             </w:tcMar>
           </w:tcPr>
           <w:p>
+            <w:pPr>
+              <w:rPr>
+                <w:sz w:val="24"/>
+                <w:szCs w:val="24"/>
+              </w:rPr>
+            </w:pPr>
             <w:r>
               <w:rPr>
                 <w:sz w:val="24"/>
@@ -6839,6 +7059,9 @@
           <w:p>
             <w:pPr>
               <w:rPr>
+                <w:rFonts w:ascii="Courier New" w:hAnsi="Courier New" w:cs="Courier New"/>
+                <w:sz w:val="20"/>
+                <w:szCs w:val="20"/>
                 <w:lang w:val="en-US"/>
               </w:rPr>
             </w:pPr>
@@ -6855,6 +7078,9 @@
           <w:p>
             <w:pPr>
               <w:rPr>
+                <w:rFonts w:ascii="Courier New" w:hAnsi="Courier New" w:cs="Courier New"/>
+                <w:sz w:val="20"/>
+                <w:szCs w:val="20"/>
                 <w:lang w:val="en-US"/>
               </w:rPr>
             </w:pPr>
@@ -6871,6 +7097,9 @@
           <w:p>
             <w:pPr>
               <w:rPr>
+                <w:rFonts w:ascii="Courier New" w:hAnsi="Courier New" w:cs="Courier New"/>
+                <w:sz w:val="20"/>
+                <w:szCs w:val="20"/>
                 <w:lang w:val="en-US"/>
               </w:rPr>
             </w:pPr>
@@ -6887,6 +7116,9 @@
           <w:p>
             <w:pPr>
               <w:rPr>
+                <w:rFonts w:ascii="Courier New" w:hAnsi="Courier New" w:cs="Courier New"/>
+                <w:sz w:val="20"/>
+                <w:szCs w:val="20"/>
                 <w:lang w:val="en-US"/>
               </w:rPr>
             </w:pPr>
@@ -6903,11 +7135,17 @@
           <w:p>
             <w:pPr>
               <w:rPr>
-                <w:lang w:val="en-US"/>
-              </w:rPr>
-            </w:pPr>
-            <w:r>
-              <w:rPr>
+                <w:rFonts w:ascii="Courier New" w:hAnsi="Courier New" w:cs="Courier New"/>
+                <w:sz w:val="20"/>
+                <w:szCs w:val="20"/>
+                <w:lang w:val="en-US"/>
+              </w:rPr>
+            </w:pPr>
+            <w:r>
+              <w:rPr>
+                <w:rFonts w:ascii="Courier New" w:hAnsi="Courier New" w:cs="Courier New"/>
+                <w:sz w:val="20"/>
+                <w:szCs w:val="20"/>
                 <w:lang w:val="en-US"/>
               </w:rPr>
               <w:t xml:space="preserve"> reflection: float,</w:t>
@@ -6916,11 +7154,17 @@
           <w:p>
             <w:pPr>
               <w:rPr>
-                <w:lang w:val="en-US"/>
-              </w:rPr>
-            </w:pPr>
-            <w:r>
-              <w:rPr>
+                <w:rFonts w:ascii="Courier New" w:hAnsi="Courier New" w:cs="Courier New"/>
+                <w:sz w:val="20"/>
+                <w:szCs w:val="20"/>
+                <w:lang w:val="en-US"/>
+              </w:rPr>
+            </w:pPr>
+            <w:r>
+              <w:rPr>
+                <w:rFonts w:ascii="Courier New" w:hAnsi="Courier New" w:cs="Courier New"/>
+                <w:sz w:val="20"/>
+                <w:szCs w:val="20"/>
                 <w:lang w:val="en-US"/>
               </w:rPr>
               <w:t xml:space="preserve"> absorption: float,</w:t>
@@ -6929,11 +7173,17 @@
           <w:p>
             <w:pPr>
               <w:rPr>
-                <w:lang w:val="en-US"/>
-              </w:rPr>
-            </w:pPr>
-            <w:r>
-              <w:rPr>
+                <w:rFonts w:ascii="Courier New" w:hAnsi="Courier New" w:cs="Courier New"/>
+                <w:sz w:val="20"/>
+                <w:szCs w:val="20"/>
+                <w:lang w:val="en-US"/>
+              </w:rPr>
+            </w:pPr>
+            <w:r>
+              <w:rPr>
+                <w:rFonts w:ascii="Courier New" w:hAnsi="Courier New" w:cs="Courier New"/>
+                <w:sz w:val="20"/>
+                <w:szCs w:val="20"/>
                 <w:lang w:val="en-US"/>
               </w:rPr>
               <w:t xml:space="preserve"> </w:t>
@@ -6941,6 +7191,9 @@
             <w:proofErr w:type="spellStart"/>
             <w:r>
               <w:rPr>
+                <w:rFonts w:ascii="Courier New" w:hAnsi="Courier New" w:cs="Courier New"/>
+                <w:sz w:val="20"/>
+                <w:szCs w:val="20"/>
                 <w:lang w:val="en-US"/>
               </w:rPr>
               <w:t>short_description</w:t>
@@ -6948,6 +7201,9 @@
             <w:proofErr w:type="spellEnd"/>
             <w:r>
               <w:rPr>
+                <w:rFonts w:ascii="Courier New" w:hAnsi="Courier New" w:cs="Courier New"/>
+                <w:sz w:val="20"/>
+                <w:szCs w:val="20"/>
                 <w:lang w:val="en-US"/>
               </w:rPr>
               <w:t>: string,</w:t>
@@ -6956,6 +7212,9 @@
           <w:p>
             <w:pPr>
               <w:rPr>
+                <w:rFonts w:ascii="Courier New" w:hAnsi="Courier New" w:cs="Courier New"/>
+                <w:sz w:val="20"/>
+                <w:szCs w:val="20"/>
                 <w:lang w:val="en-US"/>
               </w:rPr>
             </w:pPr>
@@ -6970,6 +7229,13 @@
             </w:r>
           </w:p>
           <w:p>
+            <w:pPr>
+              <w:rPr>
+                <w:rFonts w:ascii="Courier New" w:hAnsi="Courier New" w:cs="Courier New"/>
+                <w:sz w:val="20"/>
+                <w:szCs w:val="20"/>
+              </w:rPr>
+            </w:pPr>
             <w:r>
               <w:rPr>
                 <w:rFonts w:ascii="Courier New" w:eastAsia="Courier New" w:hAnsi="Courier New" w:cs="Courier New"/>
@@ -7028,6 +7294,9 @@
           <w:p>
             <w:pPr>
               <w:rPr>
+                <w:rFonts w:ascii="Courier New" w:hAnsi="Courier New" w:cs="Courier New"/>
+                <w:sz w:val="20"/>
+                <w:szCs w:val="20"/>
                 <w:lang w:val="en-US"/>
               </w:rPr>
             </w:pPr>
@@ -7044,6 +7313,9 @@
           <w:p>
             <w:pPr>
               <w:rPr>
+                <w:rFonts w:ascii="Courier New" w:hAnsi="Courier New" w:cs="Courier New"/>
+                <w:sz w:val="20"/>
+                <w:szCs w:val="20"/>
                 <w:lang w:val="en-US"/>
               </w:rPr>
             </w:pPr>
@@ -7060,6 +7332,9 @@
           <w:p>
             <w:pPr>
               <w:rPr>
+                <w:rFonts w:ascii="Courier New" w:hAnsi="Courier New" w:cs="Courier New"/>
+                <w:sz w:val="20"/>
+                <w:szCs w:val="20"/>
                 <w:lang w:val="en-US"/>
               </w:rPr>
             </w:pPr>
@@ -7076,6 +7351,9 @@
           <w:p>
             <w:pPr>
               <w:rPr>
+                <w:rFonts w:ascii="Courier New" w:hAnsi="Courier New" w:cs="Courier New"/>
+                <w:sz w:val="20"/>
+                <w:szCs w:val="20"/>
                 <w:lang w:val="en-US"/>
               </w:rPr>
             </w:pPr>
@@ -7112,6 +7390,9 @@
           <w:p>
             <w:pPr>
               <w:rPr>
+                <w:rFonts w:ascii="Courier New" w:hAnsi="Courier New" w:cs="Courier New"/>
+                <w:sz w:val="20"/>
+                <w:szCs w:val="20"/>
                 <w:lang w:val="en-US"/>
               </w:rPr>
             </w:pPr>
@@ -7148,6 +7429,9 @@
           <w:p>
             <w:pPr>
               <w:rPr>
+                <w:rFonts w:ascii="Courier New" w:hAnsi="Courier New" w:cs="Courier New"/>
+                <w:sz w:val="20"/>
+                <w:szCs w:val="20"/>
                 <w:lang w:val="en-US"/>
               </w:rPr>
             </w:pPr>
@@ -7182,6 +7466,13 @@
             </w:r>
           </w:p>
           <w:p>
+            <w:pPr>
+              <w:rPr>
+                <w:rFonts w:ascii="Courier New" w:hAnsi="Courier New" w:cs="Courier New"/>
+                <w:sz w:val="20"/>
+                <w:szCs w:val="20"/>
+              </w:rPr>
+            </w:pPr>
             <w:r>
               <w:rPr>
                 <w:rFonts w:ascii="Courier New" w:eastAsia="Courier New" w:hAnsi="Courier New" w:cs="Courier New"/>
@@ -7295,6 +7586,12 @@
             </w:tcMar>
           </w:tcPr>
           <w:p>
+            <w:pPr>
+              <w:rPr>
+                <w:sz w:val="24"/>
+                <w:szCs w:val="24"/>
+              </w:rPr>
+            </w:pPr>
             <w:r>
               <w:rPr>
                 <w:sz w:val="24"/>
@@ -7339,6 +7636,9 @@
           <w:p>
             <w:pPr>
               <w:rPr>
+                <w:rFonts w:ascii="Courier New" w:hAnsi="Courier New" w:cs="Courier New"/>
+                <w:sz w:val="20"/>
+                <w:szCs w:val="20"/>
                 <w:lang w:val="en-US"/>
               </w:rPr>
             </w:pPr>
@@ -7355,6 +7655,9 @@
           <w:p>
             <w:pPr>
               <w:rPr>
+                <w:rFonts w:ascii="Courier New" w:hAnsi="Courier New" w:cs="Courier New"/>
+                <w:sz w:val="20"/>
+                <w:szCs w:val="20"/>
                 <w:lang w:val="en-US"/>
               </w:rPr>
             </w:pPr>
@@ -7371,6 +7674,9 @@
           <w:p>
             <w:pPr>
               <w:rPr>
+                <w:rFonts w:ascii="Courier New" w:hAnsi="Courier New" w:cs="Courier New"/>
+                <w:sz w:val="20"/>
+                <w:szCs w:val="20"/>
                 <w:lang w:val="en-US"/>
               </w:rPr>
             </w:pPr>
@@ -7387,6 +7693,9 @@
           <w:p>
             <w:pPr>
               <w:rPr>
+                <w:rFonts w:ascii="Courier New" w:hAnsi="Courier New" w:cs="Courier New"/>
+                <w:sz w:val="20"/>
+                <w:szCs w:val="20"/>
                 <w:lang w:val="en-US"/>
               </w:rPr>
             </w:pPr>
@@ -7403,11 +7712,17 @@
           <w:p>
             <w:pPr>
               <w:rPr>
-                <w:lang w:val="en-US"/>
-              </w:rPr>
-            </w:pPr>
-            <w:r>
-              <w:rPr>
+                <w:rFonts w:ascii="Courier New" w:hAnsi="Courier New" w:cs="Courier New"/>
+                <w:sz w:val="20"/>
+                <w:szCs w:val="20"/>
+                <w:lang w:val="en-US"/>
+              </w:rPr>
+            </w:pPr>
+            <w:r>
+              <w:rPr>
+                <w:rFonts w:ascii="Courier New" w:hAnsi="Courier New" w:cs="Courier New"/>
+                <w:sz w:val="20"/>
+                <w:szCs w:val="20"/>
                 <w:lang w:val="en-US"/>
               </w:rPr>
               <w:t xml:space="preserve"> reflection: float,</w:t>
@@ -7416,11 +7731,17 @@
           <w:p>
             <w:pPr>
               <w:rPr>
-                <w:lang w:val="en-US"/>
-              </w:rPr>
-            </w:pPr>
-            <w:r>
-              <w:rPr>
+                <w:rFonts w:ascii="Courier New" w:hAnsi="Courier New" w:cs="Courier New"/>
+                <w:sz w:val="20"/>
+                <w:szCs w:val="20"/>
+                <w:lang w:val="en-US"/>
+              </w:rPr>
+            </w:pPr>
+            <w:r>
+              <w:rPr>
+                <w:rFonts w:ascii="Courier New" w:hAnsi="Courier New" w:cs="Courier New"/>
+                <w:sz w:val="20"/>
+                <w:szCs w:val="20"/>
                 <w:lang w:val="en-US"/>
               </w:rPr>
               <w:t xml:space="preserve"> absorption: float,</w:t>
@@ -7429,11 +7750,17 @@
           <w:p>
             <w:pPr>
               <w:rPr>
-                <w:lang w:val="en-US"/>
-              </w:rPr>
-            </w:pPr>
-            <w:r>
-              <w:rPr>
+                <w:rFonts w:ascii="Courier New" w:hAnsi="Courier New" w:cs="Courier New"/>
+                <w:sz w:val="20"/>
+                <w:szCs w:val="20"/>
+                <w:lang w:val="en-US"/>
+              </w:rPr>
+            </w:pPr>
+            <w:r>
+              <w:rPr>
+                <w:rFonts w:ascii="Courier New" w:hAnsi="Courier New" w:cs="Courier New"/>
+                <w:sz w:val="20"/>
+                <w:szCs w:val="20"/>
                 <w:lang w:val="en-US"/>
               </w:rPr>
               <w:t xml:space="preserve"> </w:t>
@@ -7441,6 +7768,9 @@
             <w:proofErr w:type="spellStart"/>
             <w:r>
               <w:rPr>
+                <w:rFonts w:ascii="Courier New" w:hAnsi="Courier New" w:cs="Courier New"/>
+                <w:sz w:val="20"/>
+                <w:szCs w:val="20"/>
                 <w:lang w:val="en-US"/>
               </w:rPr>
               <w:t>short_description</w:t>
@@ -7448,12 +7778,22 @@
             <w:proofErr w:type="spellEnd"/>
             <w:r>
               <w:rPr>
+                <w:rFonts w:ascii="Courier New" w:hAnsi="Courier New" w:cs="Courier New"/>
+                <w:sz w:val="20"/>
+                <w:szCs w:val="20"/>
                 <w:lang w:val="en-US"/>
               </w:rPr>
               <w:t>: string</w:t>
             </w:r>
           </w:p>
           <w:p>
+            <w:pPr>
+              <w:rPr>
+                <w:rFonts w:ascii="Courier New" w:hAnsi="Courier New" w:cs="Courier New"/>
+                <w:sz w:val="20"/>
+                <w:szCs w:val="20"/>
+              </w:rPr>
+            </w:pPr>
             <w:r>
               <w:rPr>
                 <w:rFonts w:ascii="Courier New" w:eastAsia="Courier New" w:hAnsi="Courier New" w:cs="Courier New"/>
@@ -7483,6 +7823,9 @@
           <w:p>
             <w:pPr>
               <w:rPr>
+                <w:rFonts w:ascii="Courier New" w:hAnsi="Courier New" w:cs="Courier New"/>
+                <w:sz w:val="20"/>
+                <w:szCs w:val="20"/>
                 <w:lang w:val="en-US"/>
               </w:rPr>
             </w:pPr>
@@ -7499,6 +7842,9 @@
           <w:p>
             <w:pPr>
               <w:rPr>
+                <w:rFonts w:ascii="Courier New" w:hAnsi="Courier New" w:cs="Courier New"/>
+                <w:sz w:val="20"/>
+                <w:szCs w:val="20"/>
                 <w:lang w:val="en-US"/>
               </w:rPr>
             </w:pPr>
@@ -7515,6 +7861,9 @@
           <w:p>
             <w:pPr>
               <w:rPr>
+                <w:rFonts w:ascii="Courier New" w:hAnsi="Courier New" w:cs="Courier New"/>
+                <w:sz w:val="20"/>
+                <w:szCs w:val="20"/>
                 <w:lang w:val="en-US"/>
               </w:rPr>
             </w:pPr>
@@ -7531,11 +7880,17 @@
           <w:p>
             <w:pPr>
               <w:rPr>
-                <w:lang w:val="en-US"/>
-              </w:rPr>
-            </w:pPr>
-            <w:r>
-              <w:rPr>
+                <w:rFonts w:ascii="Courier New" w:hAnsi="Courier New" w:cs="Courier New"/>
+                <w:sz w:val="20"/>
+                <w:szCs w:val="20"/>
+                <w:lang w:val="en-US"/>
+              </w:rPr>
+            </w:pPr>
+            <w:r>
+              <w:rPr>
+                <w:rFonts w:ascii="Courier New" w:hAnsi="Courier New" w:cs="Courier New"/>
+                <w:sz w:val="20"/>
+                <w:szCs w:val="20"/>
                 <w:lang w:val="en-US"/>
               </w:rPr>
               <w:t xml:space="preserve"> reflection: float,</w:t>
@@ -7544,11 +7899,17 @@
           <w:p>
             <w:pPr>
               <w:rPr>
-                <w:lang w:val="en-US"/>
-              </w:rPr>
-            </w:pPr>
-            <w:r>
-              <w:rPr>
+                <w:rFonts w:ascii="Courier New" w:hAnsi="Courier New" w:cs="Courier New"/>
+                <w:sz w:val="20"/>
+                <w:szCs w:val="20"/>
+                <w:lang w:val="en-US"/>
+              </w:rPr>
+            </w:pPr>
+            <w:r>
+              <w:rPr>
+                <w:rFonts w:ascii="Courier New" w:hAnsi="Courier New" w:cs="Courier New"/>
+                <w:sz w:val="20"/>
+                <w:szCs w:val="20"/>
                 <w:lang w:val="en-US"/>
               </w:rPr>
               <w:t xml:space="preserve"> absorption: float,</w:t>
@@ -7557,11 +7918,17 @@
           <w:p>
             <w:pPr>
               <w:rPr>
-                <w:lang w:val="en-US"/>
-              </w:rPr>
-            </w:pPr>
-            <w:r>
-              <w:rPr>
+                <w:rFonts w:ascii="Courier New" w:hAnsi="Courier New" w:cs="Courier New"/>
+                <w:sz w:val="20"/>
+                <w:szCs w:val="20"/>
+                <w:lang w:val="en-US"/>
+              </w:rPr>
+            </w:pPr>
+            <w:r>
+              <w:rPr>
+                <w:rFonts w:ascii="Courier New" w:hAnsi="Courier New" w:cs="Courier New"/>
+                <w:sz w:val="20"/>
+                <w:szCs w:val="20"/>
                 <w:lang w:val="en-US"/>
               </w:rPr>
               <w:t xml:space="preserve"> </w:t>
@@ -7569,6 +7936,9 @@
             <w:proofErr w:type="spellStart"/>
             <w:r>
               <w:rPr>
+                <w:rFonts w:ascii="Courier New" w:hAnsi="Courier New" w:cs="Courier New"/>
+                <w:sz w:val="20"/>
+                <w:szCs w:val="20"/>
                 <w:lang w:val="en-US"/>
               </w:rPr>
               <w:t>short_description</w:t>
@@ -7576,12 +7946,22 @@
             <w:proofErr w:type="spellEnd"/>
             <w:r>
               <w:rPr>
+                <w:rFonts w:ascii="Courier New" w:hAnsi="Courier New" w:cs="Courier New"/>
+                <w:sz w:val="20"/>
+                <w:szCs w:val="20"/>
                 <w:lang w:val="en-US"/>
               </w:rPr>
               <w:t>: string,</w:t>
             </w:r>
           </w:p>
           <w:p>
+            <w:pPr>
+              <w:rPr>
+                <w:rFonts w:ascii="Courier New" w:hAnsi="Courier New" w:cs="Courier New"/>
+                <w:sz w:val="20"/>
+                <w:szCs w:val="20"/>
+              </w:rPr>
+            </w:pPr>
             <w:r>
               <w:rPr>
                 <w:rFonts w:ascii="Courier New" w:eastAsia="Courier New" w:hAnsi="Courier New" w:cs="Courier New"/>
@@ -7621,6 +8001,13 @@
             <w:proofErr w:type="spellEnd"/>
           </w:p>
           <w:p>
+            <w:pPr>
+              <w:rPr>
+                <w:rFonts w:ascii="Courier New" w:hAnsi="Courier New" w:cs="Courier New"/>
+                <w:sz w:val="20"/>
+                <w:szCs w:val="20"/>
+              </w:rPr>
+            </w:pPr>
             <w:r>
               <w:rPr>
                 <w:rFonts w:ascii="Courier New" w:eastAsia="Courier New" w:hAnsi="Courier New" w:cs="Courier New"/>
@@ -7733,7 +8120,17 @@
             </w:tcMar>
           </w:tcPr>
           <w:p>
-            <w:r>
+            <w:pPr>
+              <w:rPr>
+                <w:sz w:val="24"/>
+                <w:szCs w:val="24"/>
+              </w:rPr>
+            </w:pPr>
+            <w:r>
+              <w:rPr>
+                <w:sz w:val="24"/>
+                <w:szCs w:val="24"/>
+              </w:rPr>
               <w:t>Логическое удаление своего пигмента (статус deleted, completed_at). Доступно создателю</w:t>
             </w:r>
           </w:p>
@@ -7757,6 +8154,9 @@
           <w:p>
             <w:pPr>
               <w:rPr>
+                <w:rFonts w:ascii="Courier New" w:hAnsi="Courier New" w:cs="Courier New"/>
+                <w:sz w:val="20"/>
+                <w:szCs w:val="20"/>
                 <w:lang w:val="en-US"/>
               </w:rPr>
             </w:pPr>
@@ -7773,6 +8173,9 @@
           <w:p>
             <w:pPr>
               <w:rPr>
+                <w:rFonts w:ascii="Courier New" w:hAnsi="Courier New" w:cs="Courier New"/>
+                <w:sz w:val="20"/>
+                <w:szCs w:val="20"/>
                 <w:lang w:val="en-US"/>
               </w:rPr>
             </w:pPr>
@@ -7789,6 +8192,9 @@
           <w:p>
             <w:pPr>
               <w:rPr>
+                <w:rFonts w:ascii="Courier New" w:hAnsi="Courier New" w:cs="Courier New"/>
+                <w:sz w:val="20"/>
+                <w:szCs w:val="20"/>
                 <w:lang w:val="en-US"/>
               </w:rPr>
             </w:pPr>
@@ -7820,6 +8226,13 @@
             </w:tcMar>
           </w:tcPr>
           <w:p>
+            <w:pPr>
+              <w:rPr>
+                <w:rFonts w:ascii="Courier New" w:hAnsi="Courier New" w:cs="Courier New"/>
+                <w:sz w:val="20"/>
+                <w:szCs w:val="20"/>
+              </w:rPr>
+            </w:pPr>
             <w:r>
               <w:rPr>
                 <w:rFonts w:ascii="Courier New" w:eastAsia="Courier New" w:hAnsi="Courier New" w:cs="Courier New"/>
@@ -7932,6 +8345,12 @@
             </w:tcMar>
           </w:tcPr>
           <w:p>
+            <w:pPr>
+              <w:rPr>
+                <w:sz w:val="24"/>
+                <w:szCs w:val="24"/>
+              </w:rPr>
+            </w:pPr>
             <w:r>
               <w:rPr>
                 <w:sz w:val="24"/>
@@ -7960,6 +8379,9 @@
           <w:p>
             <w:pPr>
               <w:rPr>
+                <w:rFonts w:ascii="Courier New" w:hAnsi="Courier New" w:cs="Courier New"/>
+                <w:sz w:val="20"/>
+                <w:szCs w:val="20"/>
                 <w:lang w:val="en-US"/>
               </w:rPr>
             </w:pPr>
@@ -7976,6 +8398,9 @@
           <w:p>
             <w:pPr>
               <w:rPr>
+                <w:rFonts w:ascii="Courier New" w:hAnsi="Courier New" w:cs="Courier New"/>
+                <w:sz w:val="20"/>
+                <w:szCs w:val="20"/>
                 <w:lang w:val="en-US"/>
               </w:rPr>
             </w:pPr>
@@ -7992,6 +8417,9 @@
           <w:p>
             <w:pPr>
               <w:rPr>
+                <w:rFonts w:ascii="Courier New" w:hAnsi="Courier New" w:cs="Courier New"/>
+                <w:sz w:val="20"/>
+                <w:szCs w:val="20"/>
                 <w:lang w:val="en-US"/>
               </w:rPr>
             </w:pPr>
@@ -8006,6 +8434,13 @@
             </w:r>
           </w:p>
           <w:p>
+            <w:pPr>
+              <w:rPr>
+                <w:rFonts w:ascii="Courier New" w:hAnsi="Courier New" w:cs="Courier New"/>
+                <w:sz w:val="20"/>
+                <w:szCs w:val="20"/>
+              </w:rPr>
+            </w:pPr>
             <w:r>
               <w:rPr>
                 <w:rFonts w:ascii="Courier New" w:eastAsia="Courier New" w:hAnsi="Courier New" w:cs="Courier New"/>
@@ -8016,11 +8451,30 @@
             </w:r>
           </w:p>
           <w:p>
-            <w:r>
+            <w:pPr>
+              <w:rPr>
+                <w:rFonts w:ascii="Courier New" w:hAnsi="Courier New" w:cs="Courier New"/>
+                <w:sz w:val="20"/>
+                <w:szCs w:val="20"/>
+              </w:rPr>
+            </w:pPr>
+            <w:r>
+              <w:rPr>
+                <w:rFonts w:ascii="Courier New" w:hAnsi="Courier New" w:cs="Courier New"/>
+                <w:sz w:val="20"/>
+                <w:szCs w:val="20"/>
+              </w:rPr>
               <w:t xml:space="preserve"> value: 0/1</w:t>
             </w:r>
           </w:p>
           <w:p>
+            <w:pPr>
+              <w:rPr>
+                <w:rFonts w:ascii="Courier New" w:hAnsi="Courier New" w:cs="Courier New"/>
+                <w:sz w:val="20"/>
+                <w:szCs w:val="20"/>
+              </w:rPr>
+            </w:pPr>
             <w:r>
               <w:rPr>
                 <w:rFonts w:ascii="Courier New" w:eastAsia="Courier New" w:hAnsi="Courier New" w:cs="Courier New"/>
@@ -8048,6 +8502,13 @@
             </w:tcMar>
           </w:tcPr>
           <w:p>
+            <w:pPr>
+              <w:rPr>
+                <w:rFonts w:ascii="Courier New" w:hAnsi="Courier New" w:cs="Courier New"/>
+                <w:sz w:val="20"/>
+                <w:szCs w:val="20"/>
+              </w:rPr>
+            </w:pPr>
             <w:r>
               <w:rPr>
                 <w:rFonts w:ascii="Courier New" w:eastAsia="Courier New" w:hAnsi="Courier New" w:cs="Courier New"/>
@@ -8058,6 +8519,13 @@
             </w:r>
           </w:p>
           <w:p>
+            <w:pPr>
+              <w:rPr>
+                <w:rFonts w:ascii="Courier New" w:hAnsi="Courier New" w:cs="Courier New"/>
+                <w:sz w:val="20"/>
+                <w:szCs w:val="20"/>
+              </w:rPr>
+            </w:pPr>
             <w:r>
               <w:rPr>
                 <w:rFonts w:ascii="Courier New" w:eastAsia="Courier New" w:hAnsi="Courier New" w:cs="Courier New"/>
@@ -8096,6 +8564,13 @@
             <w:proofErr w:type="spellEnd"/>
           </w:p>
           <w:p>
+            <w:pPr>
+              <w:rPr>
+                <w:rFonts w:ascii="Courier New" w:hAnsi="Courier New" w:cs="Courier New"/>
+                <w:sz w:val="20"/>
+                <w:szCs w:val="20"/>
+              </w:rPr>
+            </w:pPr>
             <w:r>
               <w:rPr>
                 <w:rFonts w:ascii="Courier New" w:eastAsia="Courier New" w:hAnsi="Courier New" w:cs="Courier New"/>

</xml_diff>